<commit_message>
auto: XHS cards — 2026-08-31
</commit_message>
<xml_diff>
--- a/docs/xhs/2026-08-31/历史故事/发布文案.docx
+++ b/docs/xhs/2026-08-31/历史故事/发布文案.docx
@@ -11,7 +11,7 @@
         <w:rPr>
           <w:color w:val="CC3333"/>
         </w:rPr>
-        <w:t>古代科技有多牛？看这1个发明就够了</w:t>
+        <w:t>所有历史迷！把蔡伦造纸术焊脑子里！</w:t>
       </w:r>
     </w:p>
     <w:p>
@@ -40,25 +40,22 @@
         <w:spacing w:line="384" w:lineRule="auto"/>
       </w:pPr>
       <w:r>
-        <w:t>你知道吗？东汉有个太守，放着好好的官不做，天天蹲在河边发呆，最后居然发明了古代版"全自动鼓风机"——水排！🤯</w:t>
+        <w:t>你以为古代写字像发朋友圈一样简单？太天真了！📖 东汉那会儿，正儿八经的书得写在竹简上，一卷《史记》能装满一辆牛车，搬家纯粹是体力活。你想读点书？先锻炼麒麟臂再说！💪 缣帛倒是轻，可那价格，一卷顶半年工资，普通人连摸的资格都没有。🤯</w:t>
         <w:br/>
         <w:br/>
-        <w:t>当时冶铁全靠人力拉风箱，工人累到吐血，炉温还是上不去。杜诗看着河水哗哗流，突然一拍大腿：这不就是现成的动力吗？🔥</w:t>
+        <w:t>就在这种“要么重死、要么贵死”的夹缝里，蔡伦——一个宦官，居然用树皮、麻头、破布、旧渔网这些废品，给文化界来了一波降维打击！🛠️ 他改进的造纸术，让轻薄的纸成本直接跌破地板，贵族专属的书写材料瞬间变成平民日用品。🔥</w:t>
         <w:br/>
         <w:br/>
-        <w:t>他设计了超聪明的水排：河水冲击水轮，水轮带动连杆，连杆拉扯皮囊，一开一合疯狂送风。炉火瞬间蹿高三丈，铁水哗啦啦流出来，产量质量双双起飞！老百姓感动到哭，称他"前有召父，后有杜母"——说他和西汉召信臣一样，都是南阳百姓的"亲爸妈"！😂</w:t>
+        <w:t>这三个名场面：竹简重到哭、缣帛贵到跪、蔡伦出手变废为宝。哪个不让人直呼666？💯</w:t>
         <w:br/>
         <w:br/>
-        <w:t>讲真，这才是顶级创新思维——不是硬造工具，而是发现自然里本来就有的力量，然后借力打力。就像我们现在说的"顺势而为"，两千年前杜诗就玩明白了。💡</w:t>
+        <w:t>金句来了：真正的伟大，不是发明一个让少数人炫耀的东西，而是让所有人都能握住文明的火把。✨</w:t>
         <w:br/>
         <w:br/>
-        <w:t>还有个小细节：水排不仅省人力，还把冶铁效率提升好几倍，让铁器变得便宜又结实，妥妥的"技术改变生活"。难怪史书都给他记了一笔。📖</w:t>
+        <w:t>蔡伦的纸一出现，知识的传播速度直接从2G飙到5G，后来的印刷术、科举制全都踩着这块垫脚石起飞。📍 冷知识：那会儿的纸原料里，可能混着你爷爷的爷爷的破渔网（不是）😂</w:t>
         <w:br/>
         <w:br/>
-        <w:t>有时候觉得，古人比我们会"偷懒"多了。他们不是更累，而是更懂怎么用巧劲。真正的智慧，从来不是蛮干，而是懂得让万物为你所用。✨</w:t>
-        <w:br/>
-        <w:br/>
-        <w:t>如果穿越回东汉，我真想蹲在河边看看那个"水排"转起来的样子！你最想见识哪件古人发明？评论区点名，我下期讲！👇</w:t>
+        <w:t>所以啊，下次写作业写到想撕纸时，想想蔡伦——他让写字从举重运动变成了指尖舞蹈。📚 最后问一句：要是真能穿越回东汉，你愿意帮蔡伦捡破布，还是带一卷现代A4纸去炫富？评论区等你👇</w:t>
       </w:r>
     </w:p>
     <w:p>
@@ -91,7 +88,7 @@
           <w:b/>
           <w:sz w:val="32"/>
         </w:rPr>
-        <w:t>古人发明真绝</w:t>
+        <w:t>蔡伦这波封神</w:t>
       </w:r>
     </w:p>
     <w:p>
@@ -110,7 +107,7 @@
         <w:rPr>
           <w:sz w:val="24"/>
         </w:rPr>
-        <w:t>#1  东汉 · 杜诗发明水排  [古代科技]</w:t>
+        <w:t>#1  东汉 · 蔡伦改进造纸术  [古代科技发明]</w:t>
       </w:r>
     </w:p>
     <w:p>
@@ -118,7 +115,7 @@
         <w:spacing w:line="336" w:lineRule="auto"/>
       </w:pPr>
       <w:r>
-        <w:t>💡 善用自然之力，巧思改善民生，创新来源于对生活的观察。</w:t>
+        <w:t>💡 伟大的发明不一定是无中生有，让昂贵技术变成人人都用得起的普惠技术，同样惠泽千秋。</w:t>
       </w:r>
     </w:p>
     <w:p/>

</xml_diff>